<commit_message>
Docs: stages 5b and 5c in Act VIII; a figure plan and references for the paper draft
Act VIII section 30 now carries the identified-neuron stages (every
number cited; uncited budget unchanged at 20). The paper draft gains a
figure plan mapping each planned figure to an existing script output, and
references for the identified-neuron, body-model and connectome sources.
PDFs rebuilt.

Co-Authored-By: Claude Opus 5.5 <noreply@anthropic.com>
</commit_message>
<xml_diff>
--- a/report/PAPER_DRAFT.docx
+++ b/report/PAPER_DRAFT.docx
@@ -812,11 +812,860 @@
           <w:color w:val="1F4E79"/>
           <w:sz w:val="23"/>
         </w:rPr>
-        <w:t>Data and code</w:t>
-      </w:r>
+        <w:t>Figures (planned; each exists as a script output)</w:t>
+      </w:r>
+    </w:p>
+    <w:tbl>
+      <w:tblPr>
+        <w:tblW w:type="dxa" w:w="8496"/>
+        <w:jc w:val="center"/>
+        <w:tblBorders>
+          <w:top w:val="single" w:color="auto" w:sz="6"/>
+          <w:left w:val="single" w:color="auto" w:sz="6"/>
+          <w:bottom w:val="single" w:color="auto" w:sz="6"/>
+          <w:right w:val="single" w:color="auto" w:sz="6"/>
+        </w:tblBorders>
+        <w:tblLayout w:type="fixed"/>
+        <w:tblLook w:firstColumn="1" w:firstRow="1" w:lastColumn="0" w:lastRow="0" w:noHBand="0" w:noVBand="1" w:val="04A0"/>
+      </w:tblPr>
+      <w:tblGrid>
+        <w:gridCol w:w="638"/>
+        <w:gridCol w:w="1674"/>
+        <w:gridCol w:w="6184"/>
+      </w:tblGrid>
+      <w:tr>
+        <w:trPr>
+          <w:cantSplit/>
+          <w:tblHeader/>
+        </w:trPr>
+        <w:tc>
+          <w:tcPr>
+            <w:tcW w:type="dxa" w:w="638"/>
+            <w:shd w:val="clear" w:color="auto" w:fill="1F4E79"/>
+            <w:vAlign w:val="center"/>
+          </w:tcPr>
+          <w:p>
+            <w:pPr>
+              <w:keepNext/>
+              <w:spacing w:after="0"/>
+            </w:pPr>
+            <w:r>
+              <w:rPr>
+                <w:rFonts w:ascii="Calibri" w:hAnsi="Calibri"/>
+                <w:b/>
+                <w:i w:val="0"/>
+                <w:color w:val="FFFFFF"/>
+                <w:sz w:val="20"/>
+              </w:rPr>
+              <w:t>Figure</w:t>
+            </w:r>
+          </w:p>
+        </w:tc>
+        <w:tc>
+          <w:tcPr>
+            <w:tcW w:type="dxa" w:w="1674"/>
+            <w:shd w:val="clear" w:color="auto" w:fill="1F4E79"/>
+            <w:vAlign w:val="center"/>
+          </w:tcPr>
+          <w:p>
+            <w:pPr>
+              <w:keepNext/>
+              <w:spacing w:after="0"/>
+            </w:pPr>
+            <w:r>
+              <w:rPr>
+                <w:rFonts w:ascii="Calibri" w:hAnsi="Calibri"/>
+                <w:b/>
+                <w:i w:val="0"/>
+                <w:color w:val="FFFFFF"/>
+                <w:sz w:val="20"/>
+              </w:rPr>
+              <w:t>What it shows</w:t>
+            </w:r>
+          </w:p>
+        </w:tc>
+        <w:tc>
+          <w:tcPr>
+            <w:tcW w:type="dxa" w:w="6184"/>
+            <w:shd w:val="clear" w:color="auto" w:fill="1F4E79"/>
+            <w:vAlign w:val="center"/>
+          </w:tcPr>
+          <w:p>
+            <w:pPr>
+              <w:keepNext/>
+              <w:spacing w:after="0"/>
+            </w:pPr>
+            <w:r>
+              <w:rPr>
+                <w:rFonts w:ascii="Calibri" w:hAnsi="Calibri"/>
+                <w:b/>
+                <w:i w:val="0"/>
+                <w:color w:val="FFFFFF"/>
+                <w:sz w:val="20"/>
+              </w:rPr>
+              <w:t>File</w:t>
+            </w:r>
+          </w:p>
+        </w:tc>
+      </w:tr>
+      <w:tr>
+        <w:trPr>
+          <w:cantSplit/>
+        </w:trPr>
+        <w:tc>
+          <w:tcPr>
+            <w:tcW w:type="dxa" w:w="638"/>
+            <w:shd w:val="clear" w:color="auto" w:fill="FFFFFF"/>
+            <w:vAlign w:val="center"/>
+          </w:tcPr>
+          <w:p>
+            <w:pPr>
+              <w:keepNext/>
+              <w:spacing w:after="0"/>
+              <w:jc w:val="center"/>
+            </w:pPr>
+            <w:r>
+              <w:rPr>
+                <w:rFonts w:ascii="Calibri" w:hAnsi="Calibri"/>
+                <w:b/>
+                <w:i w:val="0"/>
+                <w:color w:val="222222"/>
+                <w:sz w:val="20"/>
+              </w:rPr>
+              <w:t>1</w:t>
+            </w:r>
+          </w:p>
+        </w:tc>
+        <w:tc>
+          <w:tcPr>
+            <w:tcW w:type="dxa" w:w="1674"/>
+            <w:shd w:val="clear" w:color="auto" w:fill="FFFFFF"/>
+            <w:vAlign w:val="center"/>
+          </w:tcPr>
+          <w:p>
+            <w:pPr>
+              <w:keepNext/>
+              <w:spacing w:after="0"/>
+            </w:pPr>
+            <w:r>
+              <w:rPr>
+                <w:rFonts w:ascii="Calibri" w:hAnsi="Calibri"/>
+                <w:b w:val="0"/>
+                <w:i w:val="0"/>
+                <w:color w:val="222222"/>
+                <w:sz w:val="20"/>
+              </w:rPr>
+              <w:t>The chip and the animal under the drug knobs: chip change against behavioural disruption, per dose</w:t>
+            </w:r>
+          </w:p>
+        </w:tc>
+        <w:tc>
+          <w:tcPr>
+            <w:tcW w:type="dxa" w:w="6184"/>
+            <w:shd w:val="clear" w:color="auto" w:fill="FFFFFF"/>
+            <w:vAlign w:val="center"/>
+          </w:tcPr>
+          <w:p>
+            <w:pPr>
+              <w:keepNext/>
+              <w:spacing w:after="0"/>
+            </w:pPr>
+            <w:r>
+              <w:rPr>
+                <w:rFonts w:ascii="Consolas" w:hAnsi="Consolas"/>
+                <w:b w:val="0"/>
+                <w:i w:val="0"/>
+                <w:color w:val="222222"/>
+                <w:sz w:val="18"/>
+              </w:rPr>
+              <w:t>outputs/figures/fly_chip_to_animal_dose_SIMULATED.png</w:t>
+            </w:r>
+          </w:p>
+        </w:tc>
+      </w:tr>
+      <w:tr>
+        <w:trPr>
+          <w:cantSplit/>
+        </w:trPr>
+        <w:tc>
+          <w:tcPr>
+            <w:tcW w:type="dxa" w:w="638"/>
+            <w:shd w:val="clear" w:color="auto" w:fill="F7F9FB"/>
+            <w:vAlign w:val="center"/>
+          </w:tcPr>
+          <w:p>
+            <w:pPr>
+              <w:keepNext/>
+              <w:spacing w:after="0"/>
+              <w:jc w:val="center"/>
+            </w:pPr>
+            <w:r>
+              <w:rPr>
+                <w:rFonts w:ascii="Calibri" w:hAnsi="Calibri"/>
+                <w:b/>
+                <w:i w:val="0"/>
+                <w:color w:val="222222"/>
+                <w:sz w:val="20"/>
+              </w:rPr>
+              <w:t>2</w:t>
+            </w:r>
+          </w:p>
+        </w:tc>
+        <w:tc>
+          <w:tcPr>
+            <w:tcW w:type="dxa" w:w="1674"/>
+            <w:shd w:val="clear" w:color="auto" w:fill="F7F9FB"/>
+            <w:vAlign w:val="center"/>
+          </w:tcPr>
+          <w:p>
+            <w:pPr>
+              <w:keepNext/>
+              <w:spacing w:after="0"/>
+            </w:pPr>
+            <w:r>
+              <w:rPr>
+                <w:rFonts w:ascii="Calibri" w:hAnsi="Calibri"/>
+                <w:b w:val="0"/>
+                <w:i w:val="0"/>
+                <w:color w:val="222222"/>
+                <w:sz w:val="20"/>
+              </w:rPr>
+              <w:t>When the chip flags each family against when behaviour fails (neural level)</w:t>
+            </w:r>
+          </w:p>
+        </w:tc>
+        <w:tc>
+          <w:tcPr>
+            <w:tcW w:type="dxa" w:w="6184"/>
+            <w:shd w:val="clear" w:color="auto" w:fill="F7F9FB"/>
+            <w:vAlign w:val="center"/>
+          </w:tcPr>
+          <w:p>
+            <w:pPr>
+              <w:keepNext/>
+              <w:spacing w:after="0"/>
+            </w:pPr>
+            <w:r>
+              <w:rPr>
+                <w:rFonts w:ascii="Consolas" w:hAnsi="Consolas"/>
+                <w:b w:val="0"/>
+                <w:i w:val="0"/>
+                <w:color w:val="222222"/>
+                <w:sz w:val="18"/>
+              </w:rPr>
+              <w:t>outputs/figures/fly_sentinel_ladder_SIMULATED.png</w:t>
+            </w:r>
+          </w:p>
+        </w:tc>
+      </w:tr>
+      <w:tr>
+        <w:trPr>
+          <w:cantSplit/>
+        </w:trPr>
+        <w:tc>
+          <w:tcPr>
+            <w:tcW w:type="dxa" w:w="638"/>
+            <w:shd w:val="clear" w:color="auto" w:fill="FFFFFF"/>
+            <w:vAlign w:val="center"/>
+          </w:tcPr>
+          <w:p>
+            <w:pPr>
+              <w:keepNext/>
+              <w:spacing w:after="0"/>
+              <w:jc w:val="center"/>
+            </w:pPr>
+            <w:r>
+              <w:rPr>
+                <w:rFonts w:ascii="Calibri" w:hAnsi="Calibri"/>
+                <w:b/>
+                <w:i w:val="0"/>
+                <w:color w:val="222222"/>
+                <w:sz w:val="20"/>
+              </w:rPr>
+              <w:t>3</w:t>
+            </w:r>
+          </w:p>
+        </w:tc>
+        <w:tc>
+          <w:tcPr>
+            <w:tcW w:type="dxa" w:w="1674"/>
+            <w:shd w:val="clear" w:color="auto" w:fill="FFFFFF"/>
+            <w:vAlign w:val="center"/>
+          </w:tcPr>
+          <w:p>
+            <w:pPr>
+              <w:keepNext/>
+              <w:spacing w:after="0"/>
+            </w:pPr>
+            <w:r>
+              <w:rPr>
+                <w:rFonts w:ascii="Calibri" w:hAnsi="Calibri"/>
+                <w:b w:val="0"/>
+                <w:i w:val="0"/>
+                <w:color w:val="222222"/>
+                <w:sz w:val="20"/>
+              </w:rPr>
+              <w:t>Output-tract electrode against a planar array</w:t>
+            </w:r>
+          </w:p>
+        </w:tc>
+        <w:tc>
+          <w:tcPr>
+            <w:tcW w:type="dxa" w:w="6184"/>
+            <w:shd w:val="clear" w:color="auto" w:fill="FFFFFF"/>
+            <w:vAlign w:val="center"/>
+          </w:tcPr>
+          <w:p>
+            <w:pPr>
+              <w:keepNext/>
+              <w:spacing w:after="0"/>
+            </w:pPr>
+            <w:r>
+              <w:rPr>
+                <w:rFonts w:ascii="Consolas" w:hAnsi="Consolas"/>
+                <w:b w:val="0"/>
+                <w:i w:val="0"/>
+                <w:color w:val="222222"/>
+                <w:sz w:val="18"/>
+              </w:rPr>
+              <w:t>outputs/figures/fly_output_tract_SIMULATED.png</w:t>
+            </w:r>
+          </w:p>
+        </w:tc>
+      </w:tr>
+      <w:tr>
+        <w:trPr>
+          <w:cantSplit/>
+        </w:trPr>
+        <w:tc>
+          <w:tcPr>
+            <w:tcW w:type="dxa" w:w="638"/>
+            <w:shd w:val="clear" w:color="auto" w:fill="F7F9FB"/>
+            <w:vAlign w:val="center"/>
+          </w:tcPr>
+          <w:p>
+            <w:pPr>
+              <w:keepNext/>
+              <w:spacing w:after="0"/>
+              <w:jc w:val="center"/>
+            </w:pPr>
+            <w:r>
+              <w:rPr>
+                <w:rFonts w:ascii="Calibri" w:hAnsi="Calibri"/>
+                <w:b/>
+                <w:i w:val="0"/>
+                <w:color w:val="222222"/>
+                <w:sz w:val="20"/>
+              </w:rPr>
+              <w:t>4</w:t>
+            </w:r>
+          </w:p>
+        </w:tc>
+        <w:tc>
+          <w:tcPr>
+            <w:tcW w:type="dxa" w:w="1674"/>
+            <w:shd w:val="clear" w:color="auto" w:fill="F7F9FB"/>
+            <w:vAlign w:val="center"/>
+          </w:tcPr>
+          <w:p>
+            <w:pPr>
+              <w:keepNext/>
+              <w:spacing w:after="0"/>
+            </w:pPr>
+            <w:r>
+              <w:rPr>
+                <w:rFonts w:ascii="Calibri" w:hAnsi="Calibri"/>
+                <w:b w:val="0"/>
+                <w:i w:val="0"/>
+                <w:color w:val="222222"/>
+                <w:sz w:val="20"/>
+              </w:rPr>
+              <w:t>Motor-level onsets</w:t>
+            </w:r>
+          </w:p>
+        </w:tc>
+        <w:tc>
+          <w:tcPr>
+            <w:tcW w:type="dxa" w:w="6184"/>
+            <w:shd w:val="clear" w:color="auto" w:fill="F7F9FB"/>
+            <w:vAlign w:val="center"/>
+          </w:tcPr>
+          <w:p>
+            <w:pPr>
+              <w:keepNext/>
+              <w:spacing w:after="0"/>
+            </w:pPr>
+            <w:r>
+              <w:rPr>
+                <w:rFonts w:ascii="Consolas" w:hAnsi="Consolas"/>
+                <w:b w:val="0"/>
+                <w:i w:val="0"/>
+                <w:color w:val="222222"/>
+                <w:sz w:val="18"/>
+              </w:rPr>
+              <w:t>outputs/figures/fly_motor_onsets_SIMULATED.png</w:t>
+            </w:r>
+            <w:r>
+              <w:rPr>
+                <w:rFonts w:ascii="Calibri" w:hAnsi="Calibri"/>
+                <w:b w:val="0"/>
+                <w:i w:val="0"/>
+                <w:color w:val="222222"/>
+                <w:sz w:val="20"/>
+              </w:rPr>
+              <w:t xml:space="preserve">, </w:t>
+            </w:r>
+            <w:r>
+              <w:rPr>
+                <w:rFonts w:ascii="Consolas" w:hAnsi="Consolas"/>
+                <w:b w:val="0"/>
+                <w:i w:val="0"/>
+                <w:color w:val="222222"/>
+                <w:sz w:val="18"/>
+              </w:rPr>
+              <w:t>fly_motor_tie_break_SIMULATED.png</w:t>
+            </w:r>
+          </w:p>
+        </w:tc>
+      </w:tr>
+      <w:tr>
+        <w:trPr>
+          <w:cantSplit/>
+        </w:trPr>
+        <w:tc>
+          <w:tcPr>
+            <w:tcW w:type="dxa" w:w="638"/>
+            <w:shd w:val="clear" w:color="auto" w:fill="FFFFFF"/>
+            <w:vAlign w:val="center"/>
+          </w:tcPr>
+          <w:p>
+            <w:pPr>
+              <w:keepNext/>
+              <w:spacing w:after="0"/>
+              <w:jc w:val="center"/>
+            </w:pPr>
+            <w:r>
+              <w:rPr>
+                <w:rFonts w:ascii="Calibri" w:hAnsi="Calibri"/>
+                <w:b/>
+                <w:i w:val="0"/>
+                <w:color w:val="222222"/>
+                <w:sz w:val="20"/>
+              </w:rPr>
+              <w:t>5</w:t>
+            </w:r>
+          </w:p>
+        </w:tc>
+        <w:tc>
+          <w:tcPr>
+            <w:tcW w:type="dxa" w:w="1674"/>
+            <w:shd w:val="clear" w:color="auto" w:fill="FFFFFF"/>
+            <w:vAlign w:val="center"/>
+          </w:tcPr>
+          <w:p>
+            <w:pPr>
+              <w:keepNext/>
+              <w:spacing w:after="0"/>
+            </w:pPr>
+            <w:r>
+              <w:rPr>
+                <w:rFonts w:ascii="Calibri" w:hAnsi="Calibri"/>
+                <w:b w:val="0"/>
+                <w:i w:val="0"/>
+                <w:color w:val="222222"/>
+                <w:sz w:val="20"/>
+              </w:rPr>
+              <w:t>The body: the grooming reach through the brain-to-nerve-cord relay, and the proboscis</w:t>
+            </w:r>
+          </w:p>
+        </w:tc>
+        <w:tc>
+          <w:tcPr>
+            <w:tcW w:type="dxa" w:w="6184"/>
+            <w:shd w:val="clear" w:color="auto" w:fill="FFFFFF"/>
+            <w:vAlign w:val="center"/>
+          </w:tcPr>
+          <w:p>
+            <w:pPr>
+              <w:keepNext/>
+              <w:spacing w:after="0"/>
+            </w:pPr>
+            <w:r>
+              <w:rPr>
+                <w:rFonts w:ascii="Consolas" w:hAnsi="Consolas"/>
+                <w:b w:val="0"/>
+                <w:i w:val="0"/>
+                <w:color w:val="222222"/>
+                <w:sz w:val="18"/>
+              </w:rPr>
+              <w:t>outputs/figures/embodied_stage1f_depth_SIMULATED.png</w:t>
+            </w:r>
+            <w:r>
+              <w:rPr>
+                <w:rFonts w:ascii="Calibri" w:hAnsi="Calibri"/>
+                <w:b w:val="0"/>
+                <w:i w:val="0"/>
+                <w:color w:val="222222"/>
+                <w:sz w:val="20"/>
+              </w:rPr>
+              <w:t xml:space="preserve">, </w:t>
+            </w:r>
+            <w:r>
+              <w:rPr>
+                <w:rFonts w:ascii="Consolas" w:hAnsi="Consolas"/>
+                <w:b w:val="0"/>
+                <w:i w:val="0"/>
+                <w:color w:val="222222"/>
+                <w:sz w:val="18"/>
+              </w:rPr>
+              <w:t>embodied_stage2b_proboscis_SIMULATED.png</w:t>
+            </w:r>
+          </w:p>
+        </w:tc>
+      </w:tr>
+      <w:tr>
+        <w:trPr>
+          <w:cantSplit/>
+        </w:trPr>
+        <w:tc>
+          <w:tcPr>
+            <w:tcW w:type="dxa" w:w="638"/>
+            <w:shd w:val="clear" w:color="auto" w:fill="F7F9FB"/>
+            <w:vAlign w:val="center"/>
+          </w:tcPr>
+          <w:p>
+            <w:pPr>
+              <w:keepNext/>
+              <w:spacing w:after="0"/>
+              <w:jc w:val="center"/>
+            </w:pPr>
+            <w:r>
+              <w:rPr>
+                <w:rFonts w:ascii="Calibri" w:hAnsi="Calibri"/>
+                <w:b/>
+                <w:i w:val="0"/>
+                <w:color w:val="222222"/>
+                <w:sz w:val="20"/>
+              </w:rPr>
+              <w:t>6</w:t>
+            </w:r>
+          </w:p>
+        </w:tc>
+        <w:tc>
+          <w:tcPr>
+            <w:tcW w:type="dxa" w:w="1674"/>
+            <w:shd w:val="clear" w:color="auto" w:fill="F7F9FB"/>
+            <w:vAlign w:val="center"/>
+          </w:tcPr>
+          <w:p>
+            <w:pPr>
+              <w:keepNext/>
+              <w:spacing w:after="0"/>
+            </w:pPr>
+            <w:r>
+              <w:rPr>
+                <w:rFonts w:ascii="Calibri" w:hAnsi="Calibri"/>
+                <w:b w:val="0"/>
+                <w:i w:val="0"/>
+                <w:color w:val="222222"/>
+                <w:sz w:val="20"/>
+              </w:rPr>
+              <w:t>Drugs in the loop: movements against dose</w:t>
+            </w:r>
+          </w:p>
+        </w:tc>
+        <w:tc>
+          <w:tcPr>
+            <w:tcW w:type="dxa" w:w="6184"/>
+            <w:shd w:val="clear" w:color="auto" w:fill="F7F9FB"/>
+            <w:vAlign w:val="center"/>
+          </w:tcPr>
+          <w:p>
+            <w:pPr>
+              <w:keepNext/>
+              <w:spacing w:after="0"/>
+            </w:pPr>
+            <w:r>
+              <w:rPr>
+                <w:rFonts w:ascii="Consolas" w:hAnsi="Consolas"/>
+                <w:b w:val="0"/>
+                <w:i w:val="0"/>
+                <w:color w:val="222222"/>
+                <w:sz w:val="18"/>
+              </w:rPr>
+              <w:t>outputs/figures/embodied_stage4a_drugs_movement_SIMULATED.png</w:t>
+            </w:r>
+          </w:p>
+        </w:tc>
+      </w:tr>
+      <w:tr>
+        <w:trPr>
+          <w:cantSplit/>
+        </w:trPr>
+        <w:tc>
+          <w:tcPr>
+            <w:tcW w:type="dxa" w:w="638"/>
+            <w:shd w:val="clear" w:color="auto" w:fill="FFFFFF"/>
+            <w:vAlign w:val="center"/>
+          </w:tcPr>
+          <w:p>
+            <w:pPr>
+              <w:keepNext/>
+              <w:spacing w:after="0"/>
+              <w:jc w:val="center"/>
+            </w:pPr>
+            <w:r>
+              <w:rPr>
+                <w:rFonts w:ascii="Calibri" w:hAnsi="Calibri"/>
+                <w:b/>
+                <w:i w:val="0"/>
+                <w:color w:val="222222"/>
+                <w:sz w:val="20"/>
+              </w:rPr>
+              <w:t>7</w:t>
+            </w:r>
+          </w:p>
+        </w:tc>
+        <w:tc>
+          <w:tcPr>
+            <w:tcW w:type="dxa" w:w="1674"/>
+            <w:shd w:val="clear" w:color="auto" w:fill="FFFFFF"/>
+            <w:vAlign w:val="center"/>
+          </w:tcPr>
+          <w:p>
+            <w:pPr>
+              <w:keepNext/>
+              <w:spacing w:after="0"/>
+            </w:pPr>
+            <w:r>
+              <w:rPr>
+                <w:rFonts w:ascii="Calibri" w:hAnsi="Calibri"/>
+                <w:b w:val="0"/>
+                <w:i w:val="0"/>
+                <w:color w:val="222222"/>
+                <w:sz w:val="20"/>
+              </w:rPr>
+              <w:t>Walking: the published rate model's front-leg rhythm, and the registered negatives</w:t>
+            </w:r>
+          </w:p>
+        </w:tc>
+        <w:tc>
+          <w:tcPr>
+            <w:tcW w:type="dxa" w:w="6184"/>
+            <w:shd w:val="clear" w:color="auto" w:fill="FFFFFF"/>
+            <w:vAlign w:val="center"/>
+          </w:tcPr>
+          <w:p>
+            <w:pPr>
+              <w:keepNext/>
+              <w:spacing w:after="0"/>
+            </w:pPr>
+            <w:r>
+              <w:rPr>
+                <w:rFonts w:ascii="Consolas" w:hAnsi="Consolas"/>
+                <w:b w:val="0"/>
+                <w:i w:val="0"/>
+                <w:color w:val="222222"/>
+                <w:sz w:val="18"/>
+              </w:rPr>
+              <w:t>outputs/figures/embodied_stage2h_front_leg_SIMULATED.png</w:t>
+            </w:r>
+            <w:r>
+              <w:rPr>
+                <w:rFonts w:ascii="Calibri" w:hAnsi="Calibri"/>
+                <w:b w:val="0"/>
+                <w:i w:val="0"/>
+                <w:color w:val="222222"/>
+                <w:sz w:val="20"/>
+              </w:rPr>
+              <w:t xml:space="preserve">, </w:t>
+            </w:r>
+            <w:r>
+              <w:rPr>
+                <w:rFonts w:ascii="Consolas" w:hAnsi="Consolas"/>
+                <w:b w:val="0"/>
+                <w:i w:val="0"/>
+                <w:color w:val="222222"/>
+                <w:sz w:val="18"/>
+              </w:rPr>
+              <w:t>embodied_stage2c_sweep_SIMULATED.png</w:t>
+            </w:r>
+          </w:p>
+        </w:tc>
+      </w:tr>
+      <w:tr>
+        <w:trPr>
+          <w:cantSplit/>
+        </w:trPr>
+        <w:tc>
+          <w:tcPr>
+            <w:tcW w:type="dxa" w:w="638"/>
+            <w:shd w:val="clear" w:color="auto" w:fill="F7F9FB"/>
+            <w:vAlign w:val="center"/>
+          </w:tcPr>
+          <w:p>
+            <w:pPr>
+              <w:keepNext/>
+              <w:spacing w:after="0"/>
+              <w:jc w:val="center"/>
+            </w:pPr>
+            <w:r>
+              <w:rPr>
+                <w:rFonts w:ascii="Calibri" w:hAnsi="Calibri"/>
+                <w:b/>
+                <w:i w:val="0"/>
+                <w:color w:val="222222"/>
+                <w:sz w:val="20"/>
+              </w:rPr>
+              <w:t>8</w:t>
+            </w:r>
+          </w:p>
+        </w:tc>
+        <w:tc>
+          <w:tcPr>
+            <w:tcW w:type="dxa" w:w="1674"/>
+            <w:shd w:val="clear" w:color="auto" w:fill="F7F9FB"/>
+            <w:vAlign w:val="center"/>
+          </w:tcPr>
+          <w:p>
+            <w:pPr>
+              <w:keepNext/>
+              <w:spacing w:after="0"/>
+            </w:pPr>
+            <w:r>
+              <w:rPr>
+                <w:rFonts w:ascii="Calibri" w:hAnsi="Calibri"/>
+                <w:b w:val="0"/>
+                <w:i w:val="0"/>
+                <w:color w:val="222222"/>
+                <w:sz w:val="20"/>
+              </w:rPr>
+              <w:t>The closed loop and the perturbation test</w:t>
+            </w:r>
+          </w:p>
+        </w:tc>
+        <w:tc>
+          <w:tcPr>
+            <w:tcW w:type="dxa" w:w="6184"/>
+            <w:shd w:val="clear" w:color="auto" w:fill="F7F9FB"/>
+            <w:vAlign w:val="center"/>
+          </w:tcPr>
+          <w:p>
+            <w:pPr>
+              <w:keepNext/>
+              <w:spacing w:after="0"/>
+            </w:pPr>
+            <w:r>
+              <w:rPr>
+                <w:rFonts w:ascii="Consolas" w:hAnsi="Consolas"/>
+                <w:b w:val="0"/>
+                <w:i w:val="0"/>
+                <w:color w:val="222222"/>
+                <w:sz w:val="18"/>
+              </w:rPr>
+              <w:t>outputs/figures/embodied_stage3b_perturbation_SIMULATED.png</w:t>
+            </w:r>
+          </w:p>
+        </w:tc>
+      </w:tr>
+      <w:tr>
+        <w:trPr>
+          <w:cantSplit/>
+        </w:trPr>
+        <w:tc>
+          <w:tcPr>
+            <w:tcW w:type="dxa" w:w="638"/>
+            <w:shd w:val="clear" w:color="auto" w:fill="FFFFFF"/>
+            <w:vAlign w:val="center"/>
+          </w:tcPr>
+          <w:p>
+            <w:pPr>
+              <w:keepNext w:val="0"/>
+              <w:spacing w:after="0"/>
+            </w:pPr>
+            <w:r>
+              <w:rPr>
+                <w:rFonts w:ascii="Calibri" w:hAnsi="Calibri"/>
+                <w:b/>
+                <w:i w:val="0"/>
+                <w:color w:val="222222"/>
+                <w:sz w:val="20"/>
+              </w:rPr>
+              <w:t>S1</w:t>
+            </w:r>
+          </w:p>
+        </w:tc>
+        <w:tc>
+          <w:tcPr>
+            <w:tcW w:type="dxa" w:w="1674"/>
+            <w:shd w:val="clear" w:color="auto" w:fill="FFFFFF"/>
+            <w:vAlign w:val="center"/>
+          </w:tcPr>
+          <w:p>
+            <w:pPr>
+              <w:keepNext w:val="0"/>
+              <w:spacing w:after="0"/>
+            </w:pPr>
+            <w:r>
+              <w:rPr>
+                <w:rFonts w:ascii="Calibri" w:hAnsi="Calibri"/>
+                <w:b w:val="0"/>
+                <w:i w:val="0"/>
+                <w:color w:val="222222"/>
+                <w:sz w:val="20"/>
+              </w:rPr>
+              <w:t>The rhythm-measure audit</w:t>
+            </w:r>
+          </w:p>
+        </w:tc>
+        <w:tc>
+          <w:tcPr>
+            <w:tcW w:type="dxa" w:w="6184"/>
+            <w:shd w:val="clear" w:color="auto" w:fill="FFFFFF"/>
+            <w:vAlign w:val="center"/>
+          </w:tcPr>
+          <w:p>
+            <w:pPr>
+              <w:keepNext w:val="0"/>
+              <w:spacing w:after="0"/>
+            </w:pPr>
+            <w:r>
+              <w:rPr>
+                <w:rFonts w:ascii="Consolas" w:hAnsi="Consolas"/>
+                <w:b w:val="0"/>
+                <w:i w:val="0"/>
+                <w:color w:val="222222"/>
+                <w:sz w:val="18"/>
+              </w:rPr>
+              <w:t>outputs/figures/rhythm_audit_SIMULATED.png</w:t>
+            </w:r>
+          </w:p>
+        </w:tc>
+      </w:tr>
+    </w:tbl>
+    <w:p>
+      <w:pPr>
+        <w:spacing w:after="80"/>
+      </w:pPr>
     </w:p>
     <w:p>
       <w:pPr>
+        <w:keepNext/>
+        <w:spacing w:before="240" w:after="60"/>
+      </w:pPr>
+      <w:r>
+        <w:rPr>
+          <w:rFonts w:ascii="Calibri" w:hAnsi="Calibri"/>
+          <w:b/>
+          <w:i w:val="0"/>
+          <w:color w:val="1F4E79"/>
+          <w:sz w:val="23"/>
+        </w:rPr>
+        <w:t>Data and code</w:t>
+      </w:r>
+    </w:p>
+    <w:p>
+      <w:pPr>
         <w:spacing w:after="120"/>
       </w:pPr>
       <w:r>
@@ -1072,7 +1921,115 @@
           <w:color w:val="222222"/>
           <w:sz w:val="21"/>
         </w:rPr>
-        <w:t xml:space="preserve">FlyWire, FlyMimic (FlyGym), flybody, and the MEA data sources: see </w:t>
+        <w:t>Syed DS, Ravbar P, Simpson JH. Inhibitory circuits control leg movements during Drosophila grooming. eLife (2026; preprint 2024).</w:t>
+      </w:r>
+    </w:p>
+    <w:p>
+      <w:pPr>
+        <w:spacing w:after="120"/>
+        <w:ind w:left="432" w:hanging="259"/>
+      </w:pPr>
+      <w:r>
+        <w:rPr>
+          <w:rFonts w:ascii="Calibri" w:hAnsi="Calibri"/>
+          <w:b w:val="0"/>
+          <w:i w:val="0"/>
+          <w:color w:val="222222"/>
+          <w:sz w:val="21"/>
+        </w:rPr>
+        <w:t>•</w:t>
+        <w:tab/>
+      </w:r>
+      <w:r>
+        <w:rPr>
+          <w:rFonts w:ascii="Calibri" w:hAnsi="Calibri"/>
+          <w:b w:val="0"/>
+          <w:i w:val="0"/>
+          <w:color w:val="222222"/>
+          <w:sz w:val="21"/>
+        </w:rPr>
+        <w:t>Pool A-H et al. Four GABAergic interneurons impose feeding restraint in Drosophila. Neuron (2014).</w:t>
+      </w:r>
+    </w:p>
+    <w:p>
+      <w:pPr>
+        <w:spacing w:after="120"/>
+        <w:ind w:left="432" w:hanging="259"/>
+      </w:pPr>
+      <w:r>
+        <w:rPr>
+          <w:rFonts w:ascii="Calibri" w:hAnsi="Calibri"/>
+          <w:b w:val="0"/>
+          <w:i w:val="0"/>
+          <w:color w:val="222222"/>
+          <w:sz w:val="21"/>
+        </w:rPr>
+        <w:t>•</w:t>
+        <w:tab/>
+      </w:r>
+      <w:r>
+        <w:rPr>
+          <w:rFonts w:ascii="Calibri" w:hAnsi="Calibri"/>
+          <w:b w:val="0"/>
+          <w:i w:val="0"/>
+          <w:color w:val="222222"/>
+          <w:sz w:val="21"/>
+        </w:rPr>
+        <w:t>Vaxenburg R et al. Whole-body physics simulation of fruit fly locomotion. Nature (2025) (flybody).</w:t>
+      </w:r>
+    </w:p>
+    <w:p>
+      <w:pPr>
+        <w:spacing w:after="120"/>
+        <w:ind w:left="432" w:hanging="259"/>
+      </w:pPr>
+      <w:r>
+        <w:rPr>
+          <w:rFonts w:ascii="Calibri" w:hAnsi="Calibri"/>
+          <w:b w:val="0"/>
+          <w:i w:val="0"/>
+          <w:color w:val="222222"/>
+          <w:sz w:val="21"/>
+        </w:rPr>
+        <w:t>•</w:t>
+        <w:tab/>
+      </w:r>
+      <w:r>
+        <w:rPr>
+          <w:rFonts w:ascii="Calibri" w:hAnsi="Calibri"/>
+          <w:b w:val="0"/>
+          <w:i w:val="0"/>
+          <w:color w:val="222222"/>
+          <w:sz w:val="21"/>
+        </w:rPr>
+        <w:t>Dorkenwald S et al. Neuronal wiring diagram of an adult brain. Nature (2024); Schlegel P et al. Whole-brain annotation and multi-connectome cell typing of Drosophila. Nature (2024) (FlyWire).</w:t>
+      </w:r>
+    </w:p>
+    <w:p>
+      <w:pPr>
+        <w:spacing w:after="120"/>
+        <w:ind w:left="432" w:hanging="259"/>
+      </w:pPr>
+      <w:r>
+        <w:rPr>
+          <w:rFonts w:ascii="Calibri" w:hAnsi="Calibri"/>
+          <w:b w:val="0"/>
+          <w:i w:val="0"/>
+          <w:color w:val="222222"/>
+          <w:sz w:val="21"/>
+        </w:rPr>
+        <w:t>•</w:t>
+        <w:tab/>
+      </w:r>
+      <w:r>
+        <w:rPr>
+          <w:rFonts w:ascii="Calibri" w:hAnsi="Calibri"/>
+          <w:b w:val="0"/>
+          <w:i w:val="0"/>
+          <w:color w:val="222222"/>
+          <w:sz w:val="21"/>
+        </w:rPr>
+        <w:t xml:space="preserve">FlyMimic (FlyGym 2), the MEA data sources and every other dataset: see </w:t>
       </w:r>
       <w:r>
         <w:rPr>

</xml_diff>